<commit_message>
Trim SOP to Purpose and Scope and Procedure only
</commit_message>
<xml_diff>
--- a/docs/SOP_Enable_Public_UI_Access_Azure_Databricks.docx
+++ b/docs/SOP_Enable_Public_UI_Access_Azure_Databricks.docx
@@ -15,201 +15,6 @@
         <w:t>SOP: Enabling Public UI Access for a Private Azure Databricks Workspace</w:t>
       </w:r>
     </w:p>
-    <w:p>
-      <w:pPr>
-        <w:spacing w:after="80"/>
-      </w:pPr>
-      <w:r>
-        <w:rPr>
-          <w:color w:val="595959"/>
-          <w:sz w:val="20"/>
-        </w:rPr>
-        <w:t>Azure Portal (UI) procedure  •  Front-end (UI / REST API) only  •  Compute and data plane remain private</w:t>
-      </w:r>
-    </w:p>
-    <w:tbl>
-      <w:tblPr>
-        <w:tblStyle w:val="TableGrid"/>
-        <w:tblW w:type="auto" w:w="0"/>
-        <w:tblLayout w:type="fixed"/>
-        <w:tblLook w:firstColumn="1" w:firstRow="1" w:lastColumn="0" w:lastRow="0" w:noHBand="0" w:noVBand="1" w:val="04A0"/>
-      </w:tblPr>
-      <w:tblGrid>
-        <w:gridCol w:w="2041"/>
-        <w:gridCol w:w="2665"/>
-        <w:gridCol w:w="2041"/>
-        <w:gridCol w:w="2665"/>
-      </w:tblGrid>
-      <w:tr>
-        <w:tc>
-          <w:tcPr>
-            <w:tcW w:type="dxa" w:w="2041"/>
-            <w:shd w:val="clear" w:color="auto" w:fill="DCE6F0"/>
-          </w:tcPr>
-          <w:p>
-            <w:r>
-              <w:rPr>
-                <w:b/>
-                <w:sz w:val="19"/>
-              </w:rPr>
-              <w:t>Document Owner</w:t>
-            </w:r>
-          </w:p>
-        </w:tc>
-        <w:tc>
-          <w:tcPr>
-            <w:tcW w:type="dxa" w:w="2665"/>
-          </w:tcPr>
-          <w:p>
-            <w:r>
-              <w:rPr>
-                <w:sz w:val="19"/>
-              </w:rPr>
-            </w:r>
-          </w:p>
-        </w:tc>
-        <w:tc>
-          <w:tcPr>
-            <w:tcW w:type="dxa" w:w="2041"/>
-            <w:shd w:val="clear" w:color="auto" w:fill="DCE6F0"/>
-          </w:tcPr>
-          <w:p>
-            <w:r>
-              <w:rPr>
-                <w:b/>
-                <w:sz w:val="19"/>
-              </w:rPr>
-              <w:t>Version</w:t>
-            </w:r>
-          </w:p>
-        </w:tc>
-        <w:tc>
-          <w:tcPr>
-            <w:tcW w:type="dxa" w:w="2665"/>
-          </w:tcPr>
-          <w:p>
-            <w:r>
-              <w:rPr>
-                <w:sz w:val="19"/>
-              </w:rPr>
-              <w:t>1.0</w:t>
-            </w:r>
-          </w:p>
-        </w:tc>
-      </w:tr>
-      <w:tr>
-        <w:tc>
-          <w:tcPr>
-            <w:tcW w:type="dxa" w:w="2041"/>
-            <w:shd w:val="clear" w:color="auto" w:fill="DCE6F0"/>
-          </w:tcPr>
-          <w:p>
-            <w:r>
-              <w:rPr>
-                <w:b/>
-                <w:sz w:val="19"/>
-              </w:rPr>
-              <w:t>Date</w:t>
-            </w:r>
-          </w:p>
-        </w:tc>
-        <w:tc>
-          <w:tcPr>
-            <w:tcW w:type="dxa" w:w="2665"/>
-          </w:tcPr>
-          <w:p>
-            <w:r>
-              <w:rPr>
-                <w:sz w:val="19"/>
-              </w:rPr>
-            </w:r>
-          </w:p>
-        </w:tc>
-        <w:tc>
-          <w:tcPr>
-            <w:tcW w:type="dxa" w:w="2041"/>
-            <w:shd w:val="clear" w:color="auto" w:fill="DCE6F0"/>
-          </w:tcPr>
-          <w:p>
-            <w:r>
-              <w:rPr>
-                <w:b/>
-                <w:sz w:val="19"/>
-              </w:rPr>
-              <w:t>Approver</w:t>
-            </w:r>
-          </w:p>
-        </w:tc>
-        <w:tc>
-          <w:tcPr>
-            <w:tcW w:type="dxa" w:w="2665"/>
-          </w:tcPr>
-          <w:p>
-            <w:r>
-              <w:rPr>
-                <w:sz w:val="19"/>
-              </w:rPr>
-            </w:r>
-          </w:p>
-        </w:tc>
-      </w:tr>
-      <w:tr>
-        <w:tc>
-          <w:tcPr>
-            <w:tcW w:type="dxa" w:w="2041"/>
-            <w:shd w:val="clear" w:color="auto" w:fill="DCE6F0"/>
-          </w:tcPr>
-          <w:p>
-            <w:r>
-              <w:rPr>
-                <w:b/>
-                <w:sz w:val="19"/>
-              </w:rPr>
-              <w:t>Workspace name / URL</w:t>
-            </w:r>
-          </w:p>
-        </w:tc>
-        <w:tc>
-          <w:tcPr>
-            <w:tcW w:type="dxa" w:w="2665"/>
-          </w:tcPr>
-          <w:p>
-            <w:r>
-              <w:rPr>
-                <w:sz w:val="19"/>
-              </w:rPr>
-            </w:r>
-          </w:p>
-        </w:tc>
-        <w:tc>
-          <w:tcPr>
-            <w:tcW w:type="dxa" w:w="2041"/>
-            <w:shd w:val="clear" w:color="auto" w:fill="DCE6F0"/>
-          </w:tcPr>
-          <w:p>
-            <w:r>
-              <w:rPr>
-                <w:b/>
-                <w:sz w:val="19"/>
-              </w:rPr>
-              <w:t>Change request #</w:t>
-            </w:r>
-          </w:p>
-        </w:tc>
-        <w:tc>
-          <w:tcPr>
-            <w:tcW w:type="dxa" w:w="2665"/>
-          </w:tcPr>
-          <w:p>
-            <w:r>
-              <w:rPr>
-                <w:sz w:val="19"/>
-              </w:rPr>
-            </w:r>
-          </w:p>
-        </w:tc>
-      </w:tr>
-    </w:tbl>
     <w:p>
       <w:pPr>
         <w:pStyle w:val="Heading1"/>
@@ -269,195 +74,7 @@
         <w:pStyle w:val="Heading1"/>
       </w:pPr>
       <w:r>
-        <w:t>2. Prerequisites</w:t>
-      </w:r>
-    </w:p>
-    <w:p>
-      <w:pPr>
-        <w:pStyle w:val="ListBullet"/>
-        <w:spacing w:after="40"/>
-      </w:pPr>
-      <w:r>
-        <w:rPr>
-          <w:b/>
-        </w:rPr>
-        <w:t xml:space="preserve">Workspace: </w:t>
-      </w:r>
-      <w:r>
-        <w:t>Azure Databricks workspace (Premium tier) already deployed as private: VNet injection, Secure Cluster Connectivity (No Public IP) enabled, Allow Public Network Access = Disabled, front-end and/or back-end Private Link configured.</w:t>
-      </w:r>
-    </w:p>
-    <w:p>
-      <w:pPr>
-        <w:pStyle w:val="ListBullet"/>
-        <w:spacing w:after="40"/>
-      </w:pPr>
-      <w:r>
-        <w:rPr>
-          <w:b/>
-        </w:rPr>
-        <w:t xml:space="preserve">Azure RBAC: </w:t>
-      </w:r>
-      <w:r>
-        <w:t>Contributor or Owner on the Azure Databricks workspace resource (to change Networking settings).</w:t>
-      </w:r>
-    </w:p>
-    <w:p>
-      <w:pPr>
-        <w:pStyle w:val="ListBullet"/>
-        <w:spacing w:after="40"/>
-      </w:pPr>
-      <w:r>
-        <w:rPr>
-          <w:b/>
-        </w:rPr>
-        <w:t xml:space="preserve">Databricks roles: </w:t>
-      </w:r>
-      <w:r>
-        <w:t>Databricks account admin (to create/attach a context-based ingress policy that restricts public IPs) and a workspace user to test login.</w:t>
-      </w:r>
-    </w:p>
-    <w:p>
-      <w:pPr>
-        <w:pStyle w:val="ListBullet"/>
-        <w:spacing w:after="40"/>
-      </w:pPr>
-      <w:r>
-        <w:rPr>
-          <w:b/>
-        </w:rPr>
-        <w:t xml:space="preserve">Change approval: </w:t>
-      </w:r>
-      <w:r>
-        <w:t>Approved change request number, maintenance window, and the list of public IP ranges (office egress / VPN / partner) that must be allowed.</w:t>
-      </w:r>
-    </w:p>
-    <w:p>
-      <w:pPr>
-        <w:pStyle w:val="Heading1"/>
-      </w:pPr>
-      <w:r>
-        <w:t>3. Important Notes and Warnings</w:t>
-      </w:r>
-    </w:p>
-    <w:p>
-      <w:pPr>
-        <w:pStyle w:val="ListBullet"/>
-        <w:spacing w:after="40"/>
-      </w:pPr>
-      <w:r>
-        <w:rPr>
-          <w:b/>
-        </w:rPr>
-        <w:t xml:space="preserve">Front-end vs back-end: </w:t>
-      </w:r>
-      <w:r>
-        <w:t>Azure Databricks networking has two independent paths. Front-end = users/clients to the workspace UI and REST API. Back-end = classic compute to the control plane. The Allow Public Network Access setting controls only the front-end path.</w:t>
-      </w:r>
-    </w:p>
-    <w:p>
-      <w:pPr>
-        <w:pStyle w:val="ListBullet"/>
-        <w:spacing w:after="40"/>
-      </w:pPr>
-      <w:r>
-        <w:rPr>
-          <w:b/>
-        </w:rPr>
-        <w:t xml:space="preserve">Clusters stay private: </w:t>
-      </w:r>
-      <w:r>
-        <w:t>Do not change Secure cluster connectivity (No Public IP), Required NSG rules, the VNet/subnets, or any private endpoint. Microsoft documents “Public access enabled” with Required NSG rules = NoAzureDatabricksRules as a supported configuration (back-end Private Link only), so clusters keep connecting privately and still get no public IP.</w:t>
-      </w:r>
-    </w:p>
-    <w:p>
-      <w:pPr>
-        <w:pStyle w:val="ListBullet"/>
-        <w:spacing w:after="40"/>
-      </w:pPr>
-      <w:r>
-        <w:rPr>
-          <w:b/>
-        </w:rPr>
-        <w:t xml:space="preserve">Exposure: </w:t>
-      </w:r>
-      <w:r>
-        <w:t>If front-end Private Link was the only way to reach the UI, enabling public network access exposes the login page to the entire internet (authentication via Microsoft Entra ID still applies). Restrict source IPs immediately (Step 4).</w:t>
-      </w:r>
-    </w:p>
-    <w:p>
-      <w:pPr>
-        <w:pStyle w:val="ListBullet"/>
-        <w:spacing w:after="40"/>
-      </w:pPr>
-      <w:r>
-        <w:rPr>
-          <w:b/>
-        </w:rPr>
-        <w:t xml:space="preserve">IP restriction: </w:t>
-      </w:r>
-      <w:r>
-        <w:t>The Azure Portal toggle is only Enabled / Disabled; Azure Databricks has no “Enabled from selected IP ranges” option at the Azure resource level. Source-IP restriction is done in Databricks: a context-based ingress policy (account console UI, recommended by Databricks) or workspace IP access lists (configured only via REST API/CLI, so not used in this UI-only SOP). Both are enforced together.</w:t>
-      </w:r>
-    </w:p>
-    <w:p>
-      <w:pPr>
-        <w:pStyle w:val="ListBullet"/>
-        <w:spacing w:after="40"/>
-      </w:pPr>
-      <w:r>
-        <w:rPr>
-          <w:b/>
-        </w:rPr>
-        <w:t xml:space="preserve">Private users: </w:t>
-      </w:r>
-      <w:r>
-        <w:t>Users on the corporate network that resolve the workspace through the private DNS zone (privatelink.azuredatabricks.net) continue to use the private endpoint; Private Link traffic is not affected by public IP rules.</w:t>
-      </w:r>
-    </w:p>
-    <w:tbl>
-      <w:tblPr>
-        <w:tblW w:type="auto" w:w="0"/>
-        <w:jc w:val="center"/>
-        <w:tblLook w:firstColumn="1" w:firstRow="1" w:lastColumn="0" w:lastRow="0" w:noHBand="0" w:noVBand="1" w:val="04A0"/>
-      </w:tblPr>
-      <w:tblGrid>
-        <w:gridCol w:w="9412"/>
-      </w:tblGrid>
-      <w:tr>
-        <w:tc>
-          <w:tcPr>
-            <w:tcW w:type="dxa" w:w="9412"/>
-            <w:shd w:val="clear" w:color="auto" w:fill="FFF4CE"/>
-          </w:tcPr>
-          <w:p>
-            <w:pPr>
-              <w:spacing w:after="0"/>
-            </w:pPr>
-            <w:r>
-              <w:rPr>
-                <w:b/>
-              </w:rPr>
-              <w:t xml:space="preserve">Warning: </w:t>
-            </w:r>
-            <w:r>
-              <w:t>If the workspace has no back-end Private Link (classic compute reaches the control plane through a NAT gateway / public egress IP), that egress IP must be included in any public IP allow rule, otherwise clusters fail to start.</w:t>
-            </w:r>
-          </w:p>
-        </w:tc>
-      </w:tr>
-    </w:tbl>
-    <w:p>
-      <w:pPr>
-        <w:spacing w:after="0"/>
-      </w:pPr>
-    </w:p>
-    <w:p>
-      <w:pPr>
-        <w:pStyle w:val="Heading1"/>
-      </w:pPr>
-      <w:r>
-        <w:t>4. Procedure</w:t>
+        <w:t>2. Procedure</w:t>
       </w:r>
     </w:p>
     <w:p>
@@ -576,7 +193,7 @@
         <w:t xml:space="preserve">2.2  </w:t>
       </w:r>
       <w:r>
-        <w:t>Record the current values (needed for rollback): Allow Public Network Access (expected: Disabled), Required NSG rules (e.g. NoAzureDatabricksRules), Secure cluster connectivity (No Public IP) (expected: Enabled).</w:t>
+        <w:t>Record the current values (needed to revert the change): Allow Public Network Access (expected: Disabled), Required NSG rules (e.g. NoAzureDatabricksRules), Secure cluster connectivity (No Public IP) (expected: Enabled).</w:t>
       </w:r>
     </w:p>
     <w:p>
@@ -957,928 +574,7 @@
         <w:t>[SCREENSHOT PLACEHOLDER: Cluster VM network interface in the managed resource group showing no public IP]</w:t>
       </w:r>
     </w:p>
-    <w:p>
-      <w:pPr>
-        <w:pStyle w:val="Heading1"/>
-      </w:pPr>
-      <w:r>
-        <w:t>5. Rollback Procedure</w:t>
-      </w:r>
-    </w:p>
-    <w:p>
-      <w:pPr>
-        <w:spacing w:after="40"/>
-      </w:pPr>
-      <w:r>
-        <w:rPr>
-          <w:b/>
-        </w:rPr>
-        <w:t xml:space="preserve">R1. </w:t>
-      </w:r>
-      <w:r>
-        <w:t>Azure Portal → Azure Databricks workspace → Settings → Networking.</w:t>
-      </w:r>
-    </w:p>
-    <w:p>
-      <w:pPr>
-        <w:spacing w:after="40"/>
-      </w:pPr>
-      <w:r>
-        <w:rPr>
-          <w:b/>
-        </w:rPr>
-        <w:t xml:space="preserve">R2. </w:t>
-      </w:r>
-      <w:r>
-        <w:t>Set Allow Public Network Access back to Disabled. Do not change any other setting. Click Save.</w:t>
-      </w:r>
-    </w:p>
-    <w:p>
-      <w:pPr>
-        <w:spacing w:after="40"/>
-      </w:pPr>
-      <w:r>
-        <w:rPr>
-          <w:b/>
-        </w:rPr>
-        <w:t xml:space="preserve">R3. </w:t>
-      </w:r>
-      <w:r>
-        <w:t>If a network policy was attached in Step 4, either keep it (it has no effect once public access is disabled) or re-attach the previous policy in the account console.</w:t>
-      </w:r>
-    </w:p>
-    <w:p>
-      <w:pPr>
-        <w:spacing w:after="40"/>
-      </w:pPr>
-      <w:r>
-        <w:rPr>
-          <w:b/>
-        </w:rPr>
-        <w:t xml:space="preserve">R4. </w:t>
-      </w:r>
-      <w:r>
-        <w:t>Verify: the Workspace URL no longer loads from a public network, still loads over Private Link, and a test cluster starts normally.</w:t>
-      </w:r>
-    </w:p>
-    <w:p>
-      <w:pPr>
-        <w:spacing w:before="60" w:after="80"/>
-        <w:ind w:left="283"/>
-        <w:shd w:val="clear" w:color="auto" w:fill="E7E6E6"/>
-      </w:pPr>
-      <w:r>
-        <w:rPr>
-          <w:i/>
-          <w:color w:val="404040"/>
-          <w:sz w:val="19"/>
-        </w:rPr>
-        <w:t>[SCREENSHOT PLACEHOLDER: Networking blade after rollback showing Allow Public Network Access = Disabled]</w:t>
-      </w:r>
-    </w:p>
-    <w:p>
-      <w:pPr>
-        <w:pStyle w:val="Heading1"/>
-      </w:pPr>
-      <w:r>
-        <w:t>6. Validation Checklist</w:t>
-      </w:r>
-    </w:p>
-    <w:tbl>
-      <w:tblPr>
-        <w:tblStyle w:val="TableGrid"/>
-        <w:tblW w:type="auto" w:w="0"/>
-        <w:jc w:val="center"/>
-        <w:tblLayout w:type="fixed"/>
-        <w:tblLook w:firstColumn="1" w:firstRow="1" w:lastColumn="0" w:lastRow="0" w:noHBand="0" w:noVBand="1" w:val="04A0"/>
-      </w:tblPr>
-      <w:tblGrid>
-        <w:gridCol w:w="454"/>
-        <w:gridCol w:w="5443"/>
-        <w:gridCol w:w="1814"/>
-        <w:gridCol w:w="1701"/>
-      </w:tblGrid>
-      <w:tr>
-        <w:tc>
-          <w:tcPr>
-            <w:tcW w:type="dxa" w:w="454"/>
-            <w:shd w:val="clear" w:color="auto" w:fill="1F3A5F"/>
-          </w:tcPr>
-          <w:p>
-            <w:r/>
-            <w:r>
-              <w:rPr>
-                <w:b/>
-                <w:color w:val="FFFFFF"/>
-                <w:sz w:val="19"/>
-              </w:rPr>
-              <w:t>#</w:t>
-            </w:r>
-          </w:p>
-        </w:tc>
-        <w:tc>
-          <w:tcPr>
-            <w:tcW w:type="dxa" w:w="5443"/>
-            <w:shd w:val="clear" w:color="auto" w:fill="1F3A5F"/>
-          </w:tcPr>
-          <w:p>
-            <w:r/>
-            <w:r>
-              <w:rPr>
-                <w:b/>
-                <w:color w:val="FFFFFF"/>
-                <w:sz w:val="19"/>
-              </w:rPr>
-              <w:t>Check</w:t>
-            </w:r>
-          </w:p>
-        </w:tc>
-        <w:tc>
-          <w:tcPr>
-            <w:tcW w:type="dxa" w:w="1814"/>
-            <w:shd w:val="clear" w:color="auto" w:fill="1F3A5F"/>
-          </w:tcPr>
-          <w:p>
-            <w:r/>
-            <w:r>
-              <w:rPr>
-                <w:b/>
-                <w:color w:val="FFFFFF"/>
-                <w:sz w:val="19"/>
-              </w:rPr>
-              <w:t>Result (Pass / Fail)</w:t>
-            </w:r>
-          </w:p>
-        </w:tc>
-        <w:tc>
-          <w:tcPr>
-            <w:tcW w:type="dxa" w:w="1701"/>
-            <w:shd w:val="clear" w:color="auto" w:fill="1F3A5F"/>
-          </w:tcPr>
-          <w:p>
-            <w:r/>
-            <w:r>
-              <w:rPr>
-                <w:b/>
-                <w:color w:val="FFFFFF"/>
-                <w:sz w:val="19"/>
-              </w:rPr>
-              <w:t>Checked by</w:t>
-            </w:r>
-          </w:p>
-        </w:tc>
-      </w:tr>
-      <w:tr>
-        <w:tc>
-          <w:tcPr>
-            <w:tcW w:type="dxa" w:w="454"/>
-          </w:tcPr>
-          <w:p>
-            <w:r/>
-            <w:r>
-              <w:rPr>
-                <w:sz w:val="19"/>
-              </w:rPr>
-              <w:t>1</w:t>
-            </w:r>
-          </w:p>
-        </w:tc>
-        <w:tc>
-          <w:tcPr>
-            <w:tcW w:type="dxa" w:w="5443"/>
-          </w:tcPr>
-          <w:p>
-            <w:r/>
-            <w:r>
-              <w:rPr>
-                <w:sz w:val="19"/>
-              </w:rPr>
-              <w:t>Change request approved and pre-change settings recorded</w:t>
-            </w:r>
-          </w:p>
-        </w:tc>
-        <w:tc>
-          <w:tcPr>
-            <w:tcW w:type="dxa" w:w="1814"/>
-          </w:tcPr>
-          <w:p>
-            <w:r/>
-            <w:r>
-              <w:rPr>
-                <w:sz w:val="19"/>
-              </w:rPr>
-            </w:r>
-          </w:p>
-        </w:tc>
-        <w:tc>
-          <w:tcPr>
-            <w:tcW w:type="dxa" w:w="1701"/>
-          </w:tcPr>
-          <w:p>
-            <w:r/>
-            <w:r>
-              <w:rPr>
-                <w:sz w:val="19"/>
-              </w:rPr>
-            </w:r>
-          </w:p>
-        </w:tc>
-      </w:tr>
-      <w:tr>
-        <w:tc>
-          <w:tcPr>
-            <w:tcW w:type="dxa" w:w="454"/>
-          </w:tcPr>
-          <w:p>
-            <w:r/>
-            <w:r>
-              <w:rPr>
-                <w:sz w:val="19"/>
-              </w:rPr>
-              <w:t>2</w:t>
-            </w:r>
-          </w:p>
-        </w:tc>
-        <w:tc>
-          <w:tcPr>
-            <w:tcW w:type="dxa" w:w="5443"/>
-          </w:tcPr>
-          <w:p>
-            <w:r/>
-            <w:r>
-              <w:rPr>
-                <w:sz w:val="19"/>
-              </w:rPr>
-              <w:t>Allow Public Network Access = Enabled; saved successfully</w:t>
-            </w:r>
-          </w:p>
-        </w:tc>
-        <w:tc>
-          <w:tcPr>
-            <w:tcW w:type="dxa" w:w="1814"/>
-          </w:tcPr>
-          <w:p>
-            <w:r/>
-            <w:r>
-              <w:rPr>
-                <w:sz w:val="19"/>
-              </w:rPr>
-            </w:r>
-          </w:p>
-        </w:tc>
-        <w:tc>
-          <w:tcPr>
-            <w:tcW w:type="dxa" w:w="1701"/>
-          </w:tcPr>
-          <w:p>
-            <w:r/>
-            <w:r>
-              <w:rPr>
-                <w:sz w:val="19"/>
-              </w:rPr>
-            </w:r>
-          </w:p>
-        </w:tc>
-      </w:tr>
-      <w:tr>
-        <w:tc>
-          <w:tcPr>
-            <w:tcW w:type="dxa" w:w="454"/>
-          </w:tcPr>
-          <w:p>
-            <w:r/>
-            <w:r>
-              <w:rPr>
-                <w:sz w:val="19"/>
-              </w:rPr>
-              <w:t>3</w:t>
-            </w:r>
-          </w:p>
-        </w:tc>
-        <w:tc>
-          <w:tcPr>
-            <w:tcW w:type="dxa" w:w="5443"/>
-          </w:tcPr>
-          <w:p>
-            <w:r/>
-            <w:r>
-              <w:rPr>
-                <w:sz w:val="19"/>
-              </w:rPr>
-              <w:t>Secure cluster connectivity (No Public IP), Required NSG rules, private endpoints unchanged</w:t>
-            </w:r>
-          </w:p>
-        </w:tc>
-        <w:tc>
-          <w:tcPr>
-            <w:tcW w:type="dxa" w:w="1814"/>
-          </w:tcPr>
-          <w:p>
-            <w:r/>
-            <w:r>
-              <w:rPr>
-                <w:sz w:val="19"/>
-              </w:rPr>
-            </w:r>
-          </w:p>
-        </w:tc>
-        <w:tc>
-          <w:tcPr>
-            <w:tcW w:type="dxa" w:w="1701"/>
-          </w:tcPr>
-          <w:p>
-            <w:r/>
-            <w:r>
-              <w:rPr>
-                <w:sz w:val="19"/>
-              </w:rPr>
-            </w:r>
-          </w:p>
-        </w:tc>
-      </w:tr>
-      <w:tr>
-        <w:tc>
-          <w:tcPr>
-            <w:tcW w:type="dxa" w:w="454"/>
-          </w:tcPr>
-          <w:p>
-            <w:r/>
-            <w:r>
-              <w:rPr>
-                <w:sz w:val="19"/>
-              </w:rPr>
-              <w:t>4</w:t>
-            </w:r>
-          </w:p>
-        </w:tc>
-        <w:tc>
-          <w:tcPr>
-            <w:tcW w:type="dxa" w:w="5443"/>
-          </w:tcPr>
-          <w:p>
-            <w:r/>
-            <w:r>
-              <w:rPr>
-                <w:sz w:val="19"/>
-              </w:rPr>
-              <w:t>Ingress policy with approved IP ranges attached and enforced (if in scope)</w:t>
-            </w:r>
-          </w:p>
-        </w:tc>
-        <w:tc>
-          <w:tcPr>
-            <w:tcW w:type="dxa" w:w="1814"/>
-          </w:tcPr>
-          <w:p>
-            <w:r/>
-            <w:r>
-              <w:rPr>
-                <w:sz w:val="19"/>
-              </w:rPr>
-            </w:r>
-          </w:p>
-        </w:tc>
-        <w:tc>
-          <w:tcPr>
-            <w:tcW w:type="dxa" w:w="1701"/>
-          </w:tcPr>
-          <w:p>
-            <w:r/>
-            <w:r>
-              <w:rPr>
-                <w:sz w:val="19"/>
-              </w:rPr>
-            </w:r>
-          </w:p>
-        </w:tc>
-      </w:tr>
-      <w:tr>
-        <w:tc>
-          <w:tcPr>
-            <w:tcW w:type="dxa" w:w="454"/>
-          </w:tcPr>
-          <w:p>
-            <w:r/>
-            <w:r>
-              <w:rPr>
-                <w:sz w:val="19"/>
-              </w:rPr>
-              <w:t>5</w:t>
-            </w:r>
-          </w:p>
-        </w:tc>
-        <w:tc>
-          <w:tcPr>
-            <w:tcW w:type="dxa" w:w="5443"/>
-          </w:tcPr>
-          <w:p>
-            <w:r/>
-            <w:r>
-              <w:rPr>
-                <w:sz w:val="19"/>
-              </w:rPr>
-              <w:t>UI login works from an allowed public network; blocked from a non-allowed IP</w:t>
-            </w:r>
-          </w:p>
-        </w:tc>
-        <w:tc>
-          <w:tcPr>
-            <w:tcW w:type="dxa" w:w="1814"/>
-          </w:tcPr>
-          <w:p>
-            <w:r/>
-            <w:r>
-              <w:rPr>
-                <w:sz w:val="19"/>
-              </w:rPr>
-            </w:r>
-          </w:p>
-        </w:tc>
-        <w:tc>
-          <w:tcPr>
-            <w:tcW w:type="dxa" w:w="1701"/>
-          </w:tcPr>
-          <w:p>
-            <w:r/>
-            <w:r>
-              <w:rPr>
-                <w:sz w:val="19"/>
-              </w:rPr>
-            </w:r>
-          </w:p>
-        </w:tc>
-      </w:tr>
-      <w:tr>
-        <w:tc>
-          <w:tcPr>
-            <w:tcW w:type="dxa" w:w="454"/>
-          </w:tcPr>
-          <w:p>
-            <w:r/>
-            <w:r>
-              <w:rPr>
-                <w:sz w:val="19"/>
-              </w:rPr>
-              <w:t>6</w:t>
-            </w:r>
-          </w:p>
-        </w:tc>
-        <w:tc>
-          <w:tcPr>
-            <w:tcW w:type="dxa" w:w="5443"/>
-          </w:tcPr>
-          <w:p>
-            <w:r/>
-            <w:r>
-              <w:rPr>
-                <w:sz w:val="19"/>
-              </w:rPr>
-              <w:t>Private Link users still connect; test cluster starts with no public IP</w:t>
-            </w:r>
-          </w:p>
-        </w:tc>
-        <w:tc>
-          <w:tcPr>
-            <w:tcW w:type="dxa" w:w="1814"/>
-          </w:tcPr>
-          <w:p>
-            <w:r/>
-            <w:r>
-              <w:rPr>
-                <w:sz w:val="19"/>
-              </w:rPr>
-            </w:r>
-          </w:p>
-        </w:tc>
-        <w:tc>
-          <w:tcPr>
-            <w:tcW w:type="dxa" w:w="1701"/>
-          </w:tcPr>
-          <w:p>
-            <w:r/>
-            <w:r>
-              <w:rPr>
-                <w:sz w:val="19"/>
-              </w:rPr>
-            </w:r>
-          </w:p>
-        </w:tc>
-      </w:tr>
-      <w:tr>
-        <w:tc>
-          <w:tcPr>
-            <w:tcW w:type="dxa" w:w="454"/>
-          </w:tcPr>
-          <w:p>
-            <w:r/>
-            <w:r>
-              <w:rPr>
-                <w:sz w:val="19"/>
-              </w:rPr>
-              <w:t>7</w:t>
-            </w:r>
-          </w:p>
-        </w:tc>
-        <w:tc>
-          <w:tcPr>
-            <w:tcW w:type="dxa" w:w="5443"/>
-          </w:tcPr>
-          <w:p>
-            <w:r/>
-            <w:r>
-              <w:rPr>
-                <w:sz w:val="19"/>
-              </w:rPr>
-              <w:t>Screenshots inserted and evidence attached to the change record</w:t>
-            </w:r>
-          </w:p>
-        </w:tc>
-        <w:tc>
-          <w:tcPr>
-            <w:tcW w:type="dxa" w:w="1814"/>
-          </w:tcPr>
-          <w:p>
-            <w:r/>
-            <w:r>
-              <w:rPr>
-                <w:sz w:val="19"/>
-              </w:rPr>
-            </w:r>
-          </w:p>
-        </w:tc>
-        <w:tc>
-          <w:tcPr>
-            <w:tcW w:type="dxa" w:w="1701"/>
-          </w:tcPr>
-          <w:p>
-            <w:r/>
-            <w:r>
-              <w:rPr>
-                <w:sz w:val="19"/>
-              </w:rPr>
-            </w:r>
-          </w:p>
-        </w:tc>
-      </w:tr>
-    </w:tbl>
-    <w:p>
-      <w:pPr>
-        <w:pStyle w:val="Heading1"/>
-      </w:pPr>
-      <w:r>
-        <w:t>7. Sign-off</w:t>
-      </w:r>
-    </w:p>
-    <w:tbl>
-      <w:tblPr>
-        <w:tblStyle w:val="TableGrid"/>
-        <w:tblW w:type="auto" w:w="0"/>
-        <w:jc w:val="center"/>
-        <w:tblLayout w:type="fixed"/>
-        <w:tblLook w:firstColumn="1" w:firstRow="1" w:lastColumn="0" w:lastRow="0" w:noHBand="0" w:noVBand="1" w:val="04A0"/>
-      </w:tblPr>
-      <w:tblGrid>
-        <w:gridCol w:w="2041"/>
-        <w:gridCol w:w="2835"/>
-        <w:gridCol w:w="2494"/>
-        <w:gridCol w:w="2041"/>
-      </w:tblGrid>
-      <w:tr>
-        <w:tc>
-          <w:tcPr>
-            <w:tcW w:type="dxa" w:w="2041"/>
-            <w:shd w:val="clear" w:color="auto" w:fill="1F3A5F"/>
-          </w:tcPr>
-          <w:p>
-            <w:r/>
-            <w:r>
-              <w:rPr>
-                <w:b/>
-                <w:color w:val="FFFFFF"/>
-                <w:sz w:val="19"/>
-              </w:rPr>
-              <w:t>Role</w:t>
-            </w:r>
-          </w:p>
-        </w:tc>
-        <w:tc>
-          <w:tcPr>
-            <w:tcW w:type="dxa" w:w="2835"/>
-            <w:shd w:val="clear" w:color="auto" w:fill="1F3A5F"/>
-          </w:tcPr>
-          <w:p>
-            <w:r/>
-            <w:r>
-              <w:rPr>
-                <w:b/>
-                <w:color w:val="FFFFFF"/>
-                <w:sz w:val="19"/>
-              </w:rPr>
-              <w:t>Name</w:t>
-            </w:r>
-          </w:p>
-        </w:tc>
-        <w:tc>
-          <w:tcPr>
-            <w:tcW w:type="dxa" w:w="2494"/>
-            <w:shd w:val="clear" w:color="auto" w:fill="1F3A5F"/>
-          </w:tcPr>
-          <w:p>
-            <w:r/>
-            <w:r>
-              <w:rPr>
-                <w:b/>
-                <w:color w:val="FFFFFF"/>
-                <w:sz w:val="19"/>
-              </w:rPr>
-              <w:t>Signature</w:t>
-            </w:r>
-          </w:p>
-        </w:tc>
-        <w:tc>
-          <w:tcPr>
-            <w:tcW w:type="dxa" w:w="2041"/>
-            <w:shd w:val="clear" w:color="auto" w:fill="1F3A5F"/>
-          </w:tcPr>
-          <w:p>
-            <w:r/>
-            <w:r>
-              <w:rPr>
-                <w:b/>
-                <w:color w:val="FFFFFF"/>
-                <w:sz w:val="19"/>
-              </w:rPr>
-              <w:t>Date</w:t>
-            </w:r>
-          </w:p>
-        </w:tc>
-      </w:tr>
-      <w:tr>
-        <w:tc>
-          <w:tcPr>
-            <w:tcW w:type="dxa" w:w="2041"/>
-          </w:tcPr>
-          <w:p>
-            <w:r/>
-            <w:r>
-              <w:rPr>
-                <w:sz w:val="19"/>
-              </w:rPr>
-              <w:t>Implemented by</w:t>
-            </w:r>
-          </w:p>
-        </w:tc>
-        <w:tc>
-          <w:tcPr>
-            <w:tcW w:type="dxa" w:w="2835"/>
-          </w:tcPr>
-          <w:p>
-            <w:r/>
-            <w:r>
-              <w:rPr>
-                <w:sz w:val="19"/>
-              </w:rPr>
-            </w:r>
-          </w:p>
-        </w:tc>
-        <w:tc>
-          <w:tcPr>
-            <w:tcW w:type="dxa" w:w="2494"/>
-          </w:tcPr>
-          <w:p>
-            <w:r/>
-            <w:r>
-              <w:rPr>
-                <w:sz w:val="19"/>
-              </w:rPr>
-            </w:r>
-          </w:p>
-        </w:tc>
-        <w:tc>
-          <w:tcPr>
-            <w:tcW w:type="dxa" w:w="2041"/>
-          </w:tcPr>
-          <w:p>
-            <w:r/>
-            <w:r>
-              <w:rPr>
-                <w:sz w:val="19"/>
-              </w:rPr>
-            </w:r>
-          </w:p>
-        </w:tc>
-      </w:tr>
-      <w:tr>
-        <w:tc>
-          <w:tcPr>
-            <w:tcW w:type="dxa" w:w="2041"/>
-          </w:tcPr>
-          <w:p>
-            <w:r/>
-            <w:r>
-              <w:rPr>
-                <w:sz w:val="19"/>
-              </w:rPr>
-              <w:t>Verified by</w:t>
-            </w:r>
-          </w:p>
-        </w:tc>
-        <w:tc>
-          <w:tcPr>
-            <w:tcW w:type="dxa" w:w="2835"/>
-          </w:tcPr>
-          <w:p>
-            <w:r/>
-            <w:r>
-              <w:rPr>
-                <w:sz w:val="19"/>
-              </w:rPr>
-            </w:r>
-          </w:p>
-        </w:tc>
-        <w:tc>
-          <w:tcPr>
-            <w:tcW w:type="dxa" w:w="2494"/>
-          </w:tcPr>
-          <w:p>
-            <w:r/>
-            <w:r>
-              <w:rPr>
-                <w:sz w:val="19"/>
-              </w:rPr>
-            </w:r>
-          </w:p>
-        </w:tc>
-        <w:tc>
-          <w:tcPr>
-            <w:tcW w:type="dxa" w:w="2041"/>
-          </w:tcPr>
-          <w:p>
-            <w:r/>
-            <w:r>
-              <w:rPr>
-                <w:sz w:val="19"/>
-              </w:rPr>
-            </w:r>
-          </w:p>
-        </w:tc>
-      </w:tr>
-      <w:tr>
-        <w:tc>
-          <w:tcPr>
-            <w:tcW w:type="dxa" w:w="2041"/>
-          </w:tcPr>
-          <w:p>
-            <w:r/>
-            <w:r>
-              <w:rPr>
-                <w:sz w:val="19"/>
-              </w:rPr>
-              <w:t>Approved by</w:t>
-            </w:r>
-          </w:p>
-        </w:tc>
-        <w:tc>
-          <w:tcPr>
-            <w:tcW w:type="dxa" w:w="2835"/>
-          </w:tcPr>
-          <w:p>
-            <w:r/>
-            <w:r>
-              <w:rPr>
-                <w:sz w:val="19"/>
-              </w:rPr>
-            </w:r>
-          </w:p>
-        </w:tc>
-        <w:tc>
-          <w:tcPr>
-            <w:tcW w:type="dxa" w:w="2494"/>
-          </w:tcPr>
-          <w:p>
-            <w:r/>
-            <w:r>
-              <w:rPr>
-                <w:sz w:val="19"/>
-              </w:rPr>
-            </w:r>
-          </w:p>
-        </w:tc>
-        <w:tc>
-          <w:tcPr>
-            <w:tcW w:type="dxa" w:w="2041"/>
-          </w:tcPr>
-          <w:p>
-            <w:r/>
-            <w:r>
-              <w:rPr>
-                <w:sz w:val="19"/>
-              </w:rPr>
-            </w:r>
-          </w:p>
-        </w:tc>
-      </w:tr>
-    </w:tbl>
-    <w:p>
-      <w:pPr>
-        <w:pStyle w:val="Heading2"/>
-      </w:pPr>
-      <w:r>
-        <w:t>References (Microsoft Learn)</w:t>
-      </w:r>
-    </w:p>
-    <w:p>
-      <w:pPr>
-        <w:spacing w:after="20"/>
-      </w:pPr>
-      <w:r>
-        <w:rPr>
-          <w:b/>
-          <w:sz w:val="17"/>
-        </w:rPr>
-        <w:t>Workspace inbound Private Link (portal Networking settings):</w:t>
-      </w:r>
-      <w:r>
-        <w:rPr>
-          <w:sz w:val="17"/>
-        </w:rPr>
-        <w:t xml:space="preserve"> https://learn.microsoft.com/azure/databricks/security/network/front-end/front-end-private-connect</w:t>
-      </w:r>
-    </w:p>
-    <w:p>
-      <w:pPr>
-        <w:spacing w:after="20"/>
-      </w:pPr>
-      <w:r>
-        <w:rPr>
-          <w:b/>
-          <w:sz w:val="17"/>
-        </w:rPr>
-        <w:t>Private Link concepts / deployment types:</w:t>
-      </w:r>
-      <w:r>
-        <w:rPr>
-          <w:sz w:val="17"/>
-        </w:rPr>
-        <w:t xml:space="preserve"> https://learn.microsoft.com/azure/databricks/security/network/classic/private-link</w:t>
-      </w:r>
-    </w:p>
-    <w:p>
-      <w:pPr>
-        <w:spacing w:after="20"/>
-      </w:pPr>
-      <w:r>
-        <w:rPr>
-          <w:b/>
-          <w:sz w:val="17"/>
-        </w:rPr>
-        <w:t>Context-based ingress control:</w:t>
-      </w:r>
-      <w:r>
-        <w:rPr>
-          <w:sz w:val="17"/>
-        </w:rPr>
-        <w:t xml:space="preserve"> https://learn.microsoft.com/azure/databricks/security/network/front-end/context-based-ingress</w:t>
-      </w:r>
-    </w:p>
-    <w:p>
-      <w:pPr>
-        <w:spacing w:after="20"/>
-      </w:pPr>
-      <w:r>
-        <w:rPr>
-          <w:b/>
-          <w:sz w:val="17"/>
-        </w:rPr>
-        <w:t>Manage workspace context-based ingress policies (account console UI):</w:t>
-      </w:r>
-      <w:r>
-        <w:rPr>
-          <w:sz w:val="17"/>
-        </w:rPr>
-        <w:t xml:space="preserve"> https://learn.microsoft.com/azure/databricks/security/network/front-end/manage-ingress-workspace</w:t>
-      </w:r>
-    </w:p>
-    <w:p>
-      <w:pPr>
-        <w:spacing w:after="20"/>
-      </w:pPr>
-      <w:r>
-        <w:rPr>
-          <w:b/>
-          <w:sz w:val="17"/>
-        </w:rPr>
-        <w:t>IP access lists:</w:t>
-      </w:r>
-      <w:r>
-        <w:rPr>
-          <w:sz w:val="17"/>
-        </w:rPr>
-        <w:t xml:space="preserve"> https://learn.microsoft.com/azure/databricks/security/network/front-end/ip-access-list</w:t>
-      </w:r>
-    </w:p>
     <w:sectPr>
-      <w:footerReference w:type="default" r:id="rId9"/>
       <w:pgSz w:w="11906" w:h="16838"/>
       <w:pgMar w:top="1134" w:right="1247" w:bottom="1134" w:left="1247" w:header="720" w:footer="720" w:gutter="0"/>
       <w:cols w:space="720"/>
@@ -1886,23 +582,6 @@
     </w:sectPr>
   </w:body>
 </w:document>
-</file>
-
-<file path=word/footer1.xml><?xml version="1.0" encoding="utf-8"?>
-<w:ftr xmlns:m="http://schemas.openxmlformats.org/officeDocument/2006/math" xmlns:mc="http://schemas.openxmlformats.org/markup-compatibility/2006" xmlns:mo="http://schemas.microsoft.com/office/mac/office/2008/main" xmlns:mv="urn:schemas-microsoft-com:mac:vml" xmlns:o="urn:schemas-microsoft-com:office:office" xmlns:r="http://schemas.openxmlformats.org/officeDocument/2006/relationships" xmlns:v="urn:schemas-microsoft-com:vml" xmlns:w10="urn:schemas-microsoft-com:office:word" xmlns:w14="http://schemas.microsoft.com/office/word/2010/wordml" xmlns:w="http://schemas.openxmlformats.org/wordprocessingml/2006/main" xmlns:wne="http://schemas.microsoft.com/office/word/2006/wordml" xmlns:wp14="http://schemas.microsoft.com/office/word/2010/wordprocessingDrawing" xmlns:wp="http://schemas.openxmlformats.org/drawingml/2006/wordprocessingDrawing" xmlns:wpc="http://schemas.microsoft.com/office/word/2010/wordprocessingCanvas" xmlns:wpg="http://schemas.microsoft.com/office/word/2010/wordprocessingGroup" xmlns:wpi="http://schemas.microsoft.com/office/word/2010/wordprocessingInk" xmlns:wps="http://schemas.microsoft.com/office/word/2010/wordprocessingShape" mc:Ignorable="w14 wp14">
-  <w:p>
-    <w:pPr>
-      <w:pStyle w:val="Footer"/>
-      <w:jc w:val="center"/>
-    </w:pPr>
-    <w:r>
-      <w:rPr>
-        <w:sz w:val="16"/>
-      </w:rPr>
-      <w:t>SOP – Enabling Public UI Access for a Private Azure Databricks Workspace</w:t>
-    </w:r>
-  </w:p>
-</w:ftr>
 </file>
 
 <file path=word/numbering.xml><?xml version="1.0" encoding="utf-8"?>

</xml_diff>